<commit_message>
Vyuthi FInal Draft till S20
</commit_message>
<xml_diff>
--- a/The_A_Shorts/2. Vyuthi/Vyuthi - Scares List.docx
+++ b/The_A_Shorts/2. Vyuthi/Vyuthi - Scares List.docx
@@ -22,18 +22,39 @@
           <w:szCs w:val="40"/>
           <w:u w:val="single"/>
         </w:rPr>
-        <w:t>The Jump Scares:</w:t>
-      </w:r>
-    </w:p>
-    <w:p>
-      <w:pPr>
-        <w:rPr>
-          <w:rFonts w:ascii="Courier New" w:hAnsi="Courier New" w:cs="Courier New"/>
-        </w:rPr>
-      </w:pPr>
-      <w:r>
-        <w:rPr>
-          <w:rFonts w:ascii="Courier New" w:hAnsi="Courier New" w:cs="Courier New"/>
+        <w:t>The Scares:</w:t>
+      </w:r>
+    </w:p>
+    <w:p>
+      <w:pPr>
+        <w:rPr>
+          <w:rFonts w:ascii="Courier New" w:hAnsi="Courier New" w:cs="Courier New"/>
+          <w:b/>
+          <w:bCs/>
+        </w:rPr>
+      </w:pPr>
+      <w:r>
+        <w:rPr>
+          <w:rFonts w:ascii="Courier New" w:hAnsi="Courier New" w:cs="Courier New"/>
+          <w:b/>
+          <w:bCs/>
+        </w:rPr>
+        <w:t>SCENE 3 – Ved turns into a status</w:t>
+      </w:r>
+    </w:p>
+    <w:p>
+      <w:pPr>
+        <w:rPr>
+          <w:rFonts w:ascii="Courier New" w:hAnsi="Courier New" w:cs="Courier New"/>
+          <w:b/>
+          <w:bCs/>
+        </w:rPr>
+      </w:pPr>
+      <w:r>
+        <w:rPr>
+          <w:rFonts w:ascii="Courier New" w:hAnsi="Courier New" w:cs="Courier New"/>
+          <w:b/>
+          <w:bCs/>
         </w:rPr>
         <w:t>SCENE 4 - Kriti shoulder tap</w:t>
       </w:r>
@@ -42,11 +63,15 @@
       <w:pPr>
         <w:rPr>
           <w:rFonts w:ascii="Courier New" w:hAnsi="Courier New" w:cs="Courier New"/>
-        </w:rPr>
-      </w:pPr>
-      <w:r>
-        <w:rPr>
-          <w:rFonts w:ascii="Courier New" w:hAnsi="Courier New" w:cs="Courier New"/>
+          <w:b/>
+          <w:bCs/>
+        </w:rPr>
+      </w:pPr>
+      <w:r>
+        <w:rPr>
+          <w:rFonts w:ascii="Courier New" w:hAnsi="Courier New" w:cs="Courier New"/>
+          <w:b/>
+          <w:bCs/>
         </w:rPr>
         <w:t>SCENE 5 – Skull face in the mirror</w:t>
       </w:r>
@@ -55,24 +80,90 @@
       <w:pPr>
         <w:rPr>
           <w:rFonts w:ascii="Courier New" w:hAnsi="Courier New" w:cs="Courier New"/>
-        </w:rPr>
-      </w:pPr>
-      <w:r>
-        <w:rPr>
-          <w:rFonts w:ascii="Courier New" w:hAnsi="Courier New" w:cs="Courier New"/>
-        </w:rPr>
-        <w:t>SCENE 5 – Door Knock</w:t>
-      </w:r>
-    </w:p>
-    <w:p>
-      <w:pPr>
-        <w:rPr>
-          <w:rFonts w:ascii="Courier New" w:hAnsi="Courier New" w:cs="Courier New"/>
-        </w:rPr>
-      </w:pPr>
-      <w:r>
-        <w:rPr>
-          <w:rFonts w:ascii="Courier New" w:hAnsi="Courier New" w:cs="Courier New"/>
+          <w:b/>
+          <w:bCs/>
+        </w:rPr>
+      </w:pPr>
+      <w:r>
+        <w:rPr>
+          <w:rFonts w:ascii="Courier New" w:hAnsi="Courier New" w:cs="Courier New"/>
+          <w:b/>
+          <w:bCs/>
+        </w:rPr>
+        <w:t xml:space="preserve">SCENE 5 – Door </w:t>
+      </w:r>
+      <w:r>
+        <w:rPr>
+          <w:rFonts w:ascii="Courier New" w:hAnsi="Courier New" w:cs="Courier New"/>
+          <w:b/>
+          <w:bCs/>
+        </w:rPr>
+        <w:t>k</w:t>
+      </w:r>
+      <w:r>
+        <w:rPr>
+          <w:rFonts w:ascii="Courier New" w:hAnsi="Courier New" w:cs="Courier New"/>
+          <w:b/>
+          <w:bCs/>
+        </w:rPr>
+        <w:t>nock</w:t>
+      </w:r>
+      <w:r>
+        <w:rPr>
+          <w:rFonts w:ascii="Courier New" w:hAnsi="Courier New" w:cs="Courier New"/>
+          <w:b/>
+          <w:bCs/>
+        </w:rPr>
+        <w:t>s and trembles</w:t>
+      </w:r>
+    </w:p>
+    <w:p>
+      <w:pPr>
+        <w:rPr>
+          <w:rFonts w:ascii="Courier New" w:hAnsi="Courier New" w:cs="Courier New"/>
+          <w:b/>
+          <w:bCs/>
+        </w:rPr>
+      </w:pPr>
+      <w:r>
+        <w:rPr>
+          <w:rFonts w:ascii="Courier New" w:hAnsi="Courier New" w:cs="Courier New"/>
+          <w:b/>
+          <w:bCs/>
+        </w:rPr>
+        <w:t>SCENE 7 – Kriti turns from groggy to creepy smile in a split second</w:t>
+      </w:r>
+    </w:p>
+    <w:p>
+      <w:pPr>
+        <w:rPr>
+          <w:rFonts w:ascii="Courier New" w:hAnsi="Courier New" w:cs="Courier New"/>
+          <w:b/>
+          <w:bCs/>
+        </w:rPr>
+      </w:pPr>
+      <w:r>
+        <w:rPr>
+          <w:rFonts w:ascii="Courier New" w:hAnsi="Courier New" w:cs="Courier New"/>
+          <w:b/>
+          <w:bCs/>
+        </w:rPr>
+        <w:t>SCENE 7 – Dark figure in the shadows</w:t>
+      </w:r>
+    </w:p>
+    <w:p>
+      <w:pPr>
+        <w:rPr>
+          <w:rFonts w:ascii="Courier New" w:hAnsi="Courier New" w:cs="Courier New"/>
+          <w:b/>
+          <w:bCs/>
+        </w:rPr>
+      </w:pPr>
+      <w:r>
+        <w:rPr>
+          <w:rFonts w:ascii="Courier New" w:hAnsi="Courier New" w:cs="Courier New"/>
+          <w:b/>
+          <w:bCs/>
         </w:rPr>
         <w:t>SCENE 8 – Giri behind the freezer door</w:t>
       </w:r>
@@ -81,11 +172,48 @@
       <w:pPr>
         <w:rPr>
           <w:rFonts w:ascii="Courier New" w:hAnsi="Courier New" w:cs="Courier New"/>
-        </w:rPr>
-      </w:pPr>
-      <w:r>
-        <w:rPr>
-          <w:rFonts w:ascii="Courier New" w:hAnsi="Courier New" w:cs="Courier New"/>
+          <w:b/>
+          <w:bCs/>
+        </w:rPr>
+      </w:pPr>
+      <w:r>
+        <w:rPr>
+          <w:rFonts w:ascii="Courier New" w:hAnsi="Courier New" w:cs="Courier New"/>
+          <w:b/>
+          <w:bCs/>
+        </w:rPr>
+        <w:t>SC</w:t>
+      </w:r>
+      <w:r>
+        <w:rPr>
+          <w:rFonts w:ascii="Courier New" w:hAnsi="Courier New" w:cs="Courier New"/>
+          <w:b/>
+          <w:bCs/>
+        </w:rPr>
+        <w:t>E</w:t>
+      </w:r>
+      <w:r>
+        <w:rPr>
+          <w:rFonts w:ascii="Courier New" w:hAnsi="Courier New" w:cs="Courier New"/>
+          <w:b/>
+          <w:bCs/>
+        </w:rPr>
+        <w:t>NE 8 – Giri’s abnormal movement</w:t>
+      </w:r>
+    </w:p>
+    <w:p>
+      <w:pPr>
+        <w:rPr>
+          <w:rFonts w:ascii="Courier New" w:hAnsi="Courier New" w:cs="Courier New"/>
+          <w:b/>
+          <w:bCs/>
+        </w:rPr>
+      </w:pPr>
+      <w:r>
+        <w:rPr>
+          <w:rFonts w:ascii="Courier New" w:hAnsi="Courier New" w:cs="Courier New"/>
+          <w:b/>
+          <w:bCs/>
         </w:rPr>
         <w:t>SCENE 9 – Landling ring</w:t>
       </w:r>
@@ -94,24 +222,56 @@
       <w:pPr>
         <w:rPr>
           <w:rFonts w:ascii="Courier New" w:hAnsi="Courier New" w:cs="Courier New"/>
-        </w:rPr>
-      </w:pPr>
-      <w:r>
-        <w:rPr>
-          <w:rFonts w:ascii="Courier New" w:hAnsi="Courier New" w:cs="Courier New"/>
-        </w:rPr>
-        <w:t>SCENE 9 – Father’s eyes move in the portrait</w:t>
-      </w:r>
-    </w:p>
-    <w:p>
-      <w:pPr>
-        <w:rPr>
-          <w:rFonts w:ascii="Courier New" w:hAnsi="Courier New" w:cs="Courier New"/>
-        </w:rPr>
-      </w:pPr>
-      <w:r>
-        <w:rPr>
-          <w:rFonts w:ascii="Courier New" w:hAnsi="Courier New" w:cs="Courier New"/>
+          <w:b/>
+          <w:bCs/>
+        </w:rPr>
+      </w:pPr>
+      <w:r>
+        <w:rPr>
+          <w:rFonts w:ascii="Courier New" w:hAnsi="Courier New" w:cs="Courier New"/>
+          <w:b/>
+          <w:bCs/>
+        </w:rPr>
+        <w:t>SCENE 9 –</w:t>
+      </w:r>
+      <w:r>
+        <w:rPr>
+          <w:rFonts w:ascii="Courier New" w:hAnsi="Courier New" w:cs="Courier New"/>
+          <w:b/>
+          <w:bCs/>
+        </w:rPr>
+        <w:t xml:space="preserve"> Parent’s </w:t>
+      </w:r>
+      <w:r>
+        <w:rPr>
+          <w:rFonts w:ascii="Courier New" w:hAnsi="Courier New" w:cs="Courier New"/>
+          <w:b/>
+          <w:bCs/>
+        </w:rPr>
+        <w:t>eyes move in the portrait</w:t>
+      </w:r>
+      <w:r>
+        <w:rPr>
+          <w:rFonts w:ascii="Courier New" w:hAnsi="Courier New" w:cs="Courier New"/>
+          <w:b/>
+          <w:bCs/>
+        </w:rPr>
+        <w:t xml:space="preserve"> with LED blast</w:t>
+      </w:r>
+    </w:p>
+    <w:p>
+      <w:pPr>
+        <w:rPr>
+          <w:rFonts w:ascii="Courier New" w:hAnsi="Courier New" w:cs="Courier New"/>
+          <w:b/>
+          <w:bCs/>
+        </w:rPr>
+      </w:pPr>
+      <w:r>
+        <w:rPr>
+          <w:rFonts w:ascii="Courier New" w:hAnsi="Courier New" w:cs="Courier New"/>
+          <w:b/>
+          <w:bCs/>
         </w:rPr>
         <w:t>SCENE 12 – Something moves behind the door</w:t>
       </w:r>
@@ -120,91 +280,322 @@
       <w:pPr>
         <w:rPr>
           <w:rFonts w:ascii="Courier New" w:hAnsi="Courier New" w:cs="Courier New"/>
-        </w:rPr>
-      </w:pPr>
-      <w:r>
-        <w:rPr>
-          <w:rFonts w:ascii="Courier New" w:hAnsi="Courier New" w:cs="Courier New"/>
-        </w:rPr>
-        <w:t>SCENE 12 – Mother’s lullaby hands</w:t>
-      </w:r>
-    </w:p>
-    <w:p>
-      <w:pPr>
-        <w:rPr>
-          <w:rFonts w:ascii="Courier New" w:hAnsi="Courier New" w:cs="Courier New"/>
-        </w:rPr>
-      </w:pPr>
-      <w:r>
-        <w:rPr>
-          <w:rFonts w:ascii="Courier New" w:hAnsi="Courier New" w:cs="Courier New"/>
-        </w:rPr>
-        <w:t>SCENE 15 – Doctor is a demon</w:t>
-      </w:r>
-    </w:p>
-    <w:p>
-      <w:pPr>
-        <w:rPr>
-          <w:rFonts w:ascii="Courier New" w:hAnsi="Courier New" w:cs="Courier New"/>
-        </w:rPr>
-      </w:pPr>
-      <w:r>
-        <w:rPr>
-          <w:rFonts w:ascii="Courier New" w:hAnsi="Courier New" w:cs="Courier New"/>
-        </w:rPr>
-        <w:t>SCENE 16 – Someone moves in the room</w:t>
-      </w:r>
-    </w:p>
-    <w:p>
-      <w:pPr>
-        <w:rPr>
-          <w:rFonts w:ascii="Courier New" w:hAnsi="Courier New" w:cs="Courier New"/>
-        </w:rPr>
-      </w:pPr>
-      <w:r>
-        <w:rPr>
-          <w:rFonts w:ascii="Courier New" w:hAnsi="Courier New" w:cs="Courier New"/>
-        </w:rPr>
-        <w:t>SCENE 16 - Hands reaching the neck</w:t>
-      </w:r>
-    </w:p>
-    <w:p>
-      <w:pPr>
-        <w:rPr>
-          <w:rFonts w:ascii="Courier New" w:hAnsi="Courier New" w:cs="Courier New"/>
-        </w:rPr>
-      </w:pPr>
-      <w:r>
-        <w:rPr>
-          <w:rFonts w:ascii="Courier New" w:hAnsi="Courier New" w:cs="Courier New"/>
-        </w:rPr>
-        <w:t>SCENE 16 – Curtain scare</w:t>
-      </w:r>
-    </w:p>
-    <w:p>
-      <w:pPr>
-        <w:rPr>
-          <w:rFonts w:ascii="Courier New" w:hAnsi="Courier New" w:cs="Courier New"/>
-        </w:rPr>
-      </w:pPr>
-      <w:r>
-        <w:rPr>
-          <w:rFonts w:ascii="Courier New" w:hAnsi="Courier New" w:cs="Courier New"/>
-        </w:rPr>
-        <w:t>SCENE 19 – Giri’s hands over Adi’s shoulder</w:t>
-      </w:r>
-    </w:p>
-    <w:p>
-      <w:pPr>
-        <w:rPr>
-          <w:rFonts w:ascii="Courier New" w:hAnsi="Courier New" w:cs="Courier New"/>
-        </w:rPr>
-      </w:pPr>
-      <w:r>
-        <w:rPr>
-          <w:rFonts w:ascii="Courier New" w:hAnsi="Courier New" w:cs="Courier New"/>
-        </w:rPr>
-        <w:t>SCENE 21 – Ved reappears</w:t>
+          <w:b/>
+          <w:bCs/>
+        </w:rPr>
+      </w:pPr>
+      <w:r>
+        <w:rPr>
+          <w:rFonts w:ascii="Courier New" w:hAnsi="Courier New" w:cs="Courier New"/>
+          <w:b/>
+          <w:bCs/>
+        </w:rPr>
+        <w:t xml:space="preserve">SCENE 12 </w:t>
+      </w:r>
+      <w:r>
+        <w:rPr>
+          <w:rFonts w:ascii="Courier New" w:hAnsi="Courier New" w:cs="Courier New"/>
+          <w:b/>
+          <w:bCs/>
+        </w:rPr>
+        <w:t xml:space="preserve">- Demonic </w:t>
+      </w:r>
+      <w:r>
+        <w:rPr>
+          <w:rFonts w:ascii="Courier New" w:hAnsi="Courier New" w:cs="Courier New"/>
+          <w:b/>
+          <w:bCs/>
+        </w:rPr>
+        <w:t>lullaby hands</w:t>
+      </w:r>
+    </w:p>
+    <w:p>
+      <w:pPr>
+        <w:rPr>
+          <w:rFonts w:ascii="Courier New" w:hAnsi="Courier New" w:cs="Courier New"/>
+          <w:b/>
+          <w:bCs/>
+        </w:rPr>
+      </w:pPr>
+      <w:r>
+        <w:rPr>
+          <w:rFonts w:ascii="Courier New" w:hAnsi="Courier New" w:cs="Courier New"/>
+          <w:b/>
+          <w:bCs/>
+        </w:rPr>
+        <w:t>SCENE 1</w:t>
+      </w:r>
+      <w:r>
+        <w:rPr>
+          <w:rFonts w:ascii="Courier New" w:hAnsi="Courier New" w:cs="Courier New"/>
+          <w:b/>
+          <w:bCs/>
+        </w:rPr>
+        <w:t>4</w:t>
+      </w:r>
+      <w:r>
+        <w:rPr>
+          <w:rFonts w:ascii="Courier New" w:hAnsi="Courier New" w:cs="Courier New"/>
+          <w:b/>
+          <w:bCs/>
+        </w:rPr>
+        <w:t xml:space="preserve"> – Doctor is a demon</w:t>
+      </w:r>
+    </w:p>
+    <w:p>
+      <w:pPr>
+        <w:rPr>
+          <w:rFonts w:ascii="Courier New" w:hAnsi="Courier New" w:cs="Courier New"/>
+          <w:b/>
+          <w:bCs/>
+        </w:rPr>
+      </w:pPr>
+      <w:r>
+        <w:rPr>
+          <w:rFonts w:ascii="Courier New" w:hAnsi="Courier New" w:cs="Courier New"/>
+          <w:b/>
+          <w:bCs/>
+        </w:rPr>
+        <w:t xml:space="preserve">SCENE 16 – </w:t>
+      </w:r>
+      <w:r>
+        <w:rPr>
+          <w:rFonts w:ascii="Courier New" w:hAnsi="Courier New" w:cs="Courier New"/>
+          <w:b/>
+          <w:bCs/>
+        </w:rPr>
+        <w:t xml:space="preserve">Photo falls and </w:t>
+      </w:r>
+      <w:r>
+        <w:rPr>
+          <w:rFonts w:ascii="Courier New" w:hAnsi="Courier New" w:cs="Courier New"/>
+          <w:b/>
+          <w:bCs/>
+        </w:rPr>
+        <w:t xml:space="preserve">something </w:t>
+      </w:r>
+      <w:r>
+        <w:rPr>
+          <w:rFonts w:ascii="Courier New" w:hAnsi="Courier New" w:cs="Courier New"/>
+          <w:b/>
+          <w:bCs/>
+        </w:rPr>
+        <w:t xml:space="preserve">moves in the </w:t>
+      </w:r>
+      <w:r>
+        <w:rPr>
+          <w:rFonts w:ascii="Courier New" w:hAnsi="Courier New" w:cs="Courier New"/>
+          <w:b/>
+          <w:bCs/>
+        </w:rPr>
+        <w:t>bed</w:t>
+      </w:r>
+      <w:r>
+        <w:rPr>
+          <w:rFonts w:ascii="Courier New" w:hAnsi="Courier New" w:cs="Courier New"/>
+          <w:b/>
+          <w:bCs/>
+        </w:rPr>
+        <w:t>room</w:t>
+      </w:r>
+    </w:p>
+    <w:p>
+      <w:pPr>
+        <w:rPr>
+          <w:rFonts w:ascii="Courier New" w:hAnsi="Courier New" w:cs="Courier New"/>
+          <w:b/>
+          <w:bCs/>
+        </w:rPr>
+      </w:pPr>
+      <w:r>
+        <w:rPr>
+          <w:rFonts w:ascii="Courier New" w:hAnsi="Courier New" w:cs="Courier New"/>
+          <w:b/>
+          <w:bCs/>
+        </w:rPr>
+        <w:t>SCENE 1</w:t>
+      </w:r>
+      <w:r>
+        <w:rPr>
+          <w:rFonts w:ascii="Courier New" w:hAnsi="Courier New" w:cs="Courier New"/>
+          <w:b/>
+          <w:bCs/>
+        </w:rPr>
+        <w:t>7</w:t>
+      </w:r>
+      <w:r>
+        <w:rPr>
+          <w:rFonts w:ascii="Courier New" w:hAnsi="Courier New" w:cs="Courier New"/>
+          <w:b/>
+          <w:bCs/>
+        </w:rPr>
+        <w:t xml:space="preserve"> – Curtain </w:t>
+      </w:r>
+      <w:r>
+        <w:rPr>
+          <w:rFonts w:ascii="Courier New" w:hAnsi="Courier New" w:cs="Courier New"/>
+          <w:b/>
+          <w:bCs/>
+        </w:rPr>
+        <w:t>fl</w:t>
+      </w:r>
+      <w:r>
+        <w:rPr>
+          <w:rFonts w:ascii="Courier New" w:hAnsi="Courier New" w:cs="Courier New"/>
+          <w:b/>
+          <w:bCs/>
+        </w:rPr>
+        <w:t>y</w:t>
+      </w:r>
+    </w:p>
+    <w:p>
+      <w:pPr>
+        <w:rPr>
+          <w:rFonts w:ascii="Courier New" w:hAnsi="Courier New" w:cs="Courier New"/>
+          <w:b/>
+          <w:bCs/>
+        </w:rPr>
+      </w:pPr>
+      <w:r>
+        <w:rPr>
+          <w:rFonts w:ascii="Courier New" w:hAnsi="Courier New" w:cs="Courier New"/>
+          <w:b/>
+          <w:bCs/>
+        </w:rPr>
+        <w:t>SCENE 17 – A ghost in front of the camera</w:t>
+      </w:r>
+    </w:p>
+    <w:p>
+      <w:pPr>
+        <w:rPr>
+          <w:rFonts w:ascii="Courier New" w:hAnsi="Courier New" w:cs="Courier New"/>
+          <w:b/>
+          <w:bCs/>
+        </w:rPr>
+      </w:pPr>
+      <w:r>
+        <w:rPr>
+          <w:rFonts w:ascii="Courier New" w:hAnsi="Courier New" w:cs="Courier New"/>
+          <w:b/>
+          <w:bCs/>
+        </w:rPr>
+        <w:t>SCENE 18 – Kriti face jump scare.</w:t>
+      </w:r>
+    </w:p>
+    <w:p>
+      <w:pPr>
+        <w:rPr>
+          <w:rFonts w:ascii="Courier New" w:hAnsi="Courier New" w:cs="Courier New"/>
+          <w:b/>
+          <w:bCs/>
+        </w:rPr>
+      </w:pPr>
+      <w:r>
+        <w:rPr>
+          <w:rFonts w:ascii="Courier New" w:hAnsi="Courier New" w:cs="Courier New"/>
+          <w:b/>
+          <w:bCs/>
+        </w:rPr>
+        <w:t xml:space="preserve">SCENE </w:t>
+      </w:r>
+      <w:r>
+        <w:rPr>
+          <w:rFonts w:ascii="Courier New" w:hAnsi="Courier New" w:cs="Courier New"/>
+          <w:b/>
+          <w:bCs/>
+        </w:rPr>
+        <w:t>18</w:t>
+      </w:r>
+      <w:r>
+        <w:rPr>
+          <w:rFonts w:ascii="Courier New" w:hAnsi="Courier New" w:cs="Courier New"/>
+          <w:b/>
+          <w:bCs/>
+        </w:rPr>
+        <w:t xml:space="preserve"> – Giri’s hands over Adi’s shoulder</w:t>
+      </w:r>
+    </w:p>
+    <w:p>
+      <w:pPr>
+        <w:rPr>
+          <w:rFonts w:ascii="Courier New" w:hAnsi="Courier New" w:cs="Courier New"/>
+          <w:b/>
+          <w:bCs/>
+        </w:rPr>
+      </w:pPr>
+      <w:r>
+        <w:rPr>
+          <w:rFonts w:ascii="Courier New" w:hAnsi="Courier New" w:cs="Courier New"/>
+          <w:b/>
+          <w:bCs/>
+        </w:rPr>
+        <w:t>SCENE 19 – Ved standing in front of the bed</w:t>
+      </w:r>
+    </w:p>
+    <w:p>
+      <w:pPr>
+        <w:rPr>
+          <w:rFonts w:ascii="Courier New" w:hAnsi="Courier New" w:cs="Courier New"/>
+          <w:b/>
+          <w:bCs/>
+        </w:rPr>
+      </w:pPr>
+      <w:r>
+        <w:rPr>
+          <w:rFonts w:ascii="Courier New" w:hAnsi="Courier New" w:cs="Courier New"/>
+          <w:b/>
+          <w:bCs/>
+        </w:rPr>
+        <w:t xml:space="preserve">SCENE 20 – Multiple </w:t>
+      </w:r>
+      <w:r>
+        <w:rPr>
+          <w:rFonts w:ascii="Courier New" w:hAnsi="Courier New" w:cs="Courier New"/>
+          <w:b/>
+          <w:bCs/>
+        </w:rPr>
+        <w:t xml:space="preserve">scares </w:t>
+      </w:r>
+      <w:r>
+        <w:rPr>
+          <w:rFonts w:ascii="Courier New" w:hAnsi="Courier New" w:cs="Courier New"/>
+          <w:b/>
+          <w:bCs/>
+        </w:rPr>
+        <w:t xml:space="preserve">under </w:t>
+      </w:r>
+      <w:r>
+        <w:rPr>
+          <w:rFonts w:ascii="Courier New" w:hAnsi="Courier New" w:cs="Courier New"/>
+          <w:b/>
+          <w:bCs/>
+        </w:rPr>
+        <w:t>the flashlight</w:t>
+      </w:r>
+    </w:p>
+    <w:p>
+      <w:pPr>
+        <w:rPr>
+          <w:rFonts w:ascii="Courier New" w:hAnsi="Courier New" w:cs="Courier New"/>
+        </w:rPr>
+      </w:pPr>
+      <w:r>
+        <w:rPr>
+          <w:rFonts w:ascii="Courier New" w:hAnsi="Courier New" w:cs="Courier New"/>
+        </w:rPr>
+        <w:t xml:space="preserve">SCENE </w:t>
+      </w:r>
+      <w:r>
+        <w:rPr>
+          <w:rFonts w:ascii="Courier New" w:hAnsi="Courier New" w:cs="Courier New"/>
+        </w:rPr>
+        <w:t>21</w:t>
+      </w:r>
+      <w:r>
+        <w:rPr>
+          <w:rFonts w:ascii="Courier New" w:hAnsi="Courier New" w:cs="Courier New"/>
+        </w:rPr>
+        <w:t xml:space="preserve"> – Ved reappears</w:t>
       </w:r>
     </w:p>
     <w:p>
@@ -275,20 +666,48 @@
         <w:rPr>
           <w:rFonts w:ascii="Courier New" w:hAnsi="Courier New" w:cs="Courier New"/>
         </w:rPr>
-        <w:t xml:space="preserve"> 22 – The Balloon scare 1</w:t>
-      </w:r>
-    </w:p>
-    <w:p>
-      <w:pPr>
-        <w:rPr>
-          <w:rFonts w:ascii="Courier New" w:hAnsi="Courier New" w:cs="Courier New"/>
-        </w:rPr>
-      </w:pPr>
-      <w:r>
-        <w:rPr>
-          <w:rFonts w:ascii="Courier New" w:hAnsi="Courier New" w:cs="Courier New"/>
-        </w:rPr>
-        <w:t>SCENE 22 – The Balloon scare 2</w:t>
+        <w:t xml:space="preserve"> 22 – The Balloon </w:t>
+      </w:r>
+      <w:proofErr w:type="gramStart"/>
+      <w:r>
+        <w:rPr>
+          <w:rFonts w:ascii="Courier New" w:hAnsi="Courier New" w:cs="Courier New"/>
+        </w:rPr>
+        <w:t>scare</w:t>
+      </w:r>
+      <w:proofErr w:type="gramEnd"/>
+      <w:r>
+        <w:rPr>
+          <w:rFonts w:ascii="Courier New" w:hAnsi="Courier New" w:cs="Courier New"/>
+        </w:rPr>
+        <w:t xml:space="preserve"> 1</w:t>
+      </w:r>
+    </w:p>
+    <w:p>
+      <w:pPr>
+        <w:rPr>
+          <w:rFonts w:ascii="Courier New" w:hAnsi="Courier New" w:cs="Courier New"/>
+        </w:rPr>
+      </w:pPr>
+      <w:r>
+        <w:rPr>
+          <w:rFonts w:ascii="Courier New" w:hAnsi="Courier New" w:cs="Courier New"/>
+        </w:rPr>
+        <w:t xml:space="preserve">SCENE 22 – The Balloon </w:t>
+      </w:r>
+      <w:proofErr w:type="gramStart"/>
+      <w:r>
+        <w:rPr>
+          <w:rFonts w:ascii="Courier New" w:hAnsi="Courier New" w:cs="Courier New"/>
+        </w:rPr>
+        <w:t>scare</w:t>
+      </w:r>
+      <w:proofErr w:type="gramEnd"/>
+      <w:r>
+        <w:rPr>
+          <w:rFonts w:ascii="Courier New" w:hAnsi="Courier New" w:cs="Courier New"/>
+        </w:rPr>
+        <w:t xml:space="preserve"> 2</w:t>
       </w:r>
     </w:p>
     <w:p>
@@ -327,6 +746,7 @@
         <w:rPr>
           <w:rFonts w:ascii="Courier New" w:hAnsi="Courier New" w:cs="Courier New"/>
         </w:rPr>
+        <w:lastRenderedPageBreak/>
         <w:t>SCENE 25 – The three Pitrus</w:t>
       </w:r>
     </w:p>

</xml_diff>

<commit_message>
Vyuthi - S26 Final Draft
</commit_message>
<xml_diff>
--- a/The_A_Shorts/2. Vyuthi/Vyuthi - Scares List.docx
+++ b/The_A_Shorts/2. Vyuthi/Vyuthi - Scares List.docx
@@ -577,150 +577,49 @@
       <w:pPr>
         <w:rPr>
           <w:rFonts w:ascii="Courier New" w:hAnsi="Courier New" w:cs="Courier New"/>
-        </w:rPr>
-      </w:pPr>
-      <w:r>
-        <w:rPr>
-          <w:rFonts w:ascii="Courier New" w:hAnsi="Courier New" w:cs="Courier New"/>
-        </w:rPr>
-        <w:t xml:space="preserve">SCENE </w:t>
-      </w:r>
-      <w:r>
-        <w:rPr>
-          <w:rFonts w:ascii="Courier New" w:hAnsi="Courier New" w:cs="Courier New"/>
-        </w:rPr>
-        <w:t>21</w:t>
-      </w:r>
-      <w:r>
-        <w:rPr>
-          <w:rFonts w:ascii="Courier New" w:hAnsi="Courier New" w:cs="Courier New"/>
-        </w:rPr>
-        <w:t xml:space="preserve"> – Ved reappears</w:t>
-      </w:r>
-    </w:p>
-    <w:p>
-      <w:pPr>
-        <w:rPr>
-          <w:rFonts w:ascii="Courier New" w:hAnsi="Courier New" w:cs="Courier New"/>
-        </w:rPr>
-      </w:pPr>
-      <w:r>
-        <w:rPr>
-          <w:rFonts w:ascii="Courier New" w:hAnsi="Courier New" w:cs="Courier New"/>
-        </w:rPr>
-        <w:t>SCENE 21 – Mother’s ghost</w:t>
-      </w:r>
-    </w:p>
-    <w:p>
-      <w:pPr>
-        <w:rPr>
-          <w:rFonts w:ascii="Courier New" w:hAnsi="Courier New" w:cs="Courier New"/>
-        </w:rPr>
-      </w:pPr>
-      <w:r>
-        <w:rPr>
-          <w:rFonts w:ascii="Courier New" w:hAnsi="Courier New" w:cs="Courier New"/>
-        </w:rPr>
-        <w:t>SCENE 21 – Kriti’s demonic scream</w:t>
-      </w:r>
-    </w:p>
-    <w:p>
-      <w:pPr>
-        <w:rPr>
-          <w:rFonts w:ascii="Courier New" w:hAnsi="Courier New" w:cs="Courier New"/>
-        </w:rPr>
-      </w:pPr>
-      <w:r>
-        <w:rPr>
-          <w:rFonts w:ascii="Courier New" w:hAnsi="Courier New" w:cs="Courier New"/>
-        </w:rPr>
-        <w:t>SCENE 22 – TV turns on</w:t>
-      </w:r>
-    </w:p>
-    <w:p>
-      <w:pPr>
-        <w:rPr>
-          <w:rFonts w:ascii="Courier New" w:hAnsi="Courier New" w:cs="Courier New"/>
-        </w:rPr>
-      </w:pPr>
-      <w:r>
-        <w:rPr>
-          <w:rFonts w:ascii="Courier New" w:hAnsi="Courier New" w:cs="Courier New"/>
-        </w:rPr>
-        <w:t>SCENE 22 – Landline rings</w:t>
-      </w:r>
-    </w:p>
-    <w:p>
-      <w:pPr>
-        <w:rPr>
-          <w:rFonts w:ascii="Courier New" w:hAnsi="Courier New" w:cs="Courier New"/>
-        </w:rPr>
-      </w:pPr>
-      <w:r>
-        <w:rPr>
-          <w:rFonts w:ascii="Courier New" w:hAnsi="Courier New" w:cs="Courier New"/>
-        </w:rPr>
-        <w:t>SCENE</w:t>
-      </w:r>
-      <w:r>
-        <w:rPr>
-          <w:rFonts w:ascii="Courier New" w:hAnsi="Courier New" w:cs="Courier New"/>
-        </w:rPr>
-        <w:t xml:space="preserve"> 22 – The Balloon </w:t>
-      </w:r>
-      <w:proofErr w:type="gramStart"/>
-      <w:r>
-        <w:rPr>
-          <w:rFonts w:ascii="Courier New" w:hAnsi="Courier New" w:cs="Courier New"/>
-        </w:rPr>
-        <w:t>scare</w:t>
-      </w:r>
-      <w:proofErr w:type="gramEnd"/>
-      <w:r>
-        <w:rPr>
-          <w:rFonts w:ascii="Courier New" w:hAnsi="Courier New" w:cs="Courier New"/>
-        </w:rPr>
-        <w:t xml:space="preserve"> 1</w:t>
-      </w:r>
-    </w:p>
-    <w:p>
-      <w:pPr>
-        <w:rPr>
-          <w:rFonts w:ascii="Courier New" w:hAnsi="Courier New" w:cs="Courier New"/>
-        </w:rPr>
-      </w:pPr>
-      <w:r>
-        <w:rPr>
-          <w:rFonts w:ascii="Courier New" w:hAnsi="Courier New" w:cs="Courier New"/>
-        </w:rPr>
-        <w:t xml:space="preserve">SCENE 22 – The Balloon </w:t>
-      </w:r>
-      <w:proofErr w:type="gramStart"/>
-      <w:r>
-        <w:rPr>
-          <w:rFonts w:ascii="Courier New" w:hAnsi="Courier New" w:cs="Courier New"/>
-        </w:rPr>
-        <w:t>scare</w:t>
-      </w:r>
-      <w:proofErr w:type="gramEnd"/>
-      <w:r>
-        <w:rPr>
-          <w:rFonts w:ascii="Courier New" w:hAnsi="Courier New" w:cs="Courier New"/>
-        </w:rPr>
-        <w:t xml:space="preserve"> 2</w:t>
-      </w:r>
-    </w:p>
-    <w:p>
-      <w:pPr>
-        <w:rPr>
-          <w:rFonts w:ascii="Courier New" w:hAnsi="Courier New" w:cs="Courier New"/>
-        </w:rPr>
-      </w:pPr>
-      <w:r>
-        <w:rPr>
-          <w:rFonts w:ascii="Courier New" w:hAnsi="Courier New" w:cs="Courier New"/>
-        </w:rPr>
-        <w:t>SCENE 23 – The mother</w:t>
+          <w:b/>
+          <w:bCs/>
+        </w:rPr>
+      </w:pPr>
+      <w:r>
+        <w:rPr>
+          <w:rFonts w:ascii="Courier New" w:hAnsi="Courier New" w:cs="Courier New"/>
+          <w:b/>
+          <w:bCs/>
+        </w:rPr>
+        <w:t>SCENE 23 – Kriti turns demonic</w:t>
+      </w:r>
+    </w:p>
+    <w:p>
+      <w:pPr>
+        <w:rPr>
+          <w:rFonts w:ascii="Courier New" w:hAnsi="Courier New" w:cs="Courier New"/>
+          <w:b/>
+          <w:bCs/>
+        </w:rPr>
+      </w:pPr>
+      <w:r>
+        <w:rPr>
+          <w:rFonts w:ascii="Courier New" w:hAnsi="Courier New" w:cs="Courier New"/>
+          <w:b/>
+          <w:bCs/>
+        </w:rPr>
+        <w:t>SCENE 24 – Old Woman Scare</w:t>
+      </w:r>
+    </w:p>
+    <w:p>
+      <w:pPr>
+        <w:rPr>
+          <w:rFonts w:ascii="Courier New" w:hAnsi="Courier New" w:cs="Courier New"/>
+        </w:rPr>
+      </w:pPr>
+      <w:r>
+        <w:rPr>
+          <w:rFonts w:ascii="Courier New" w:hAnsi="Courier New" w:cs="Courier New"/>
+          <w:b/>
+          <w:bCs/>
+        </w:rPr>
+        <w:t>SCENE 25 – TV turns on</w:t>
       </w:r>
     </w:p>
     <w:p>
@@ -746,7 +645,6 @@
         <w:rPr>
           <w:rFonts w:ascii="Courier New" w:hAnsi="Courier New" w:cs="Courier New"/>
         </w:rPr>
-        <w:lastRenderedPageBreak/>
         <w:t>SCENE 25 – The three Pitrus</w:t>
       </w:r>
     </w:p>
@@ -776,15 +674,6 @@
         <w:t>SCENE 28 – Yamadhootha’s scare</w:t>
       </w:r>
     </w:p>
-    <w:p>
-      <w:pPr>
-        <w:rPr>
-          <w:rFonts w:ascii="Courier New" w:hAnsi="Courier New" w:cs="Courier New"/>
-        </w:rPr>
-      </w:pPr>
-    </w:p>
-    <w:p/>
-    <w:p/>
     <w:sectPr>
       <w:pgSz w:w="12240" w:h="15840"/>
       <w:pgMar w:top="720" w:right="720" w:bottom="720" w:left="720" w:header="720" w:footer="720" w:gutter="0"/>

</xml_diff>